<commit_message>
Add 2 Nigeria severity/economy maps to AVM_MORGAN_TALKING_POINTS_20SLIDE_SYNC.docx
</commit_message>
<xml_diff>
--- a/AVM_MORGAN_TALKING_POINTS_20SLIDE_SYNC.docx
+++ b/AVM_MORGAN_TALKING_POINTS_20SLIDE_SYNC.docx
@@ -1143,6 +1143,159 @@
       </w:r>
     </w:p>
     <w:p/>
+    <w:p/>
+    <w:p>
+      <w:r>
+        <w:rPr>
+          <w:b/>
+          <w:color w:val="A05A00"/>
+          <w:sz w:val="30"/>
+        </w:rPr>
+        <w:t>SLIDE 4 — Graphical Representation: Severity Map (Table 1)</w:t>
+      </w:r>
+    </w:p>
+    <w:p>
+      <w:r>
+        <w:drawing>
+          <wp:inline xmlns:a="http://schemas.openxmlformats.org/drawingml/2006/main" xmlns:pic="http://schemas.openxmlformats.org/drawingml/2006/picture">
+            <wp:extent cx="5029200" cy="4055691"/>
+            <wp:docPr id="1" name="Picture 1"/>
+            <wp:cNvGraphicFramePr>
+              <a:graphicFrameLocks noChangeAspect="1"/>
+            </wp:cNvGraphicFramePr>
+            <a:graphic>
+              <a:graphicData uri="http://schemas.openxmlformats.org/drawingml/2006/picture">
+                <pic:pic>
+                  <pic:nvPicPr>
+                    <pic:cNvPr id="0" name="map_severity.png"/>
+                    <pic:cNvPicPr/>
+                  </pic:nvPicPr>
+                  <pic:blipFill>
+                    <a:blip r:embed="rId9"/>
+                    <a:stretch>
+                      <a:fillRect/>
+                    </a:stretch>
+                  </pic:blipFill>
+                  <pic:spPr>
+                    <a:xfrm>
+                      <a:off x="0" y="0"/>
+                      <a:ext cx="5029200" cy="4055691"/>
+                    </a:xfrm>
+                    <a:prstGeom prst="rect"/>
+                  </pic:spPr>
+                </pic:pic>
+              </a:graphicData>
+            </a:graphic>
+          </wp:inline>
+        </w:drawing>
+      </w:r>
+    </w:p>
+    <w:p>
+      <w:r>
+        <w:rPr>
+          <w:b w:val="0"/>
+          <w:sz w:val="27"/>
+        </w:rPr>
+        <w:t>Visual on screen: a colour-graded map of Nigeria. The seven North-Central units (Plateau, Niger, Benue, Kwara, Kogi, Nasarawa, FCT) are shaded on a gradient from pale gold to deep red, scaled to each state's share of the 1,304 recorded regional incidents from Table 1. All other states are shown muted, for geographic context only.</w:t>
+      </w:r>
+    </w:p>
+    <w:p>
+      <w:r>
+        <w:rPr>
+          <w:b/>
+          <w:color w:val="A05A00"/>
+          <w:sz w:val="27"/>
+        </w:rPr>
+        <w:t>SAY: Look at the map, not the spreadsheet — Plateau and Niger carry the deepest red. That is where this crisis is heaviest right now.</w:t>
+      </w:r>
+    </w:p>
+    <w:p>
+      <w:r>
+        <w:rPr>
+          <w:b w:val="0"/>
+          <w:i/>
+          <w:color w:val="666666"/>
+          <w:sz w:val="20"/>
+        </w:rPr>
+        <w:t>Pacing: ~40 sec</w:t>
+      </w:r>
+    </w:p>
+    <w:p>
+      <w:r>
+        <w:rPr>
+          <w:b/>
+          <w:color w:val="A05A00"/>
+          <w:sz w:val="30"/>
+        </w:rPr>
+        <w:t>SLIDE 5 — Graphical Representation: Economic Exposure Map (Table 2)</w:t>
+      </w:r>
+    </w:p>
+    <w:p>
+      <w:r>
+        <w:drawing>
+          <wp:inline xmlns:a="http://schemas.openxmlformats.org/drawingml/2006/main" xmlns:pic="http://schemas.openxmlformats.org/drawingml/2006/picture">
+            <wp:extent cx="5029200" cy="4055691"/>
+            <wp:docPr id="2" name="Picture 2"/>
+            <wp:cNvGraphicFramePr>
+              <a:graphicFrameLocks noChangeAspect="1"/>
+            </wp:cNvGraphicFramePr>
+            <a:graphic>
+              <a:graphicData uri="http://schemas.openxmlformats.org/drawingml/2006/picture">
+                <pic:pic>
+                  <pic:nvPicPr>
+                    <pic:cNvPr id="0" name="map_economy.png"/>
+                    <pic:cNvPicPr/>
+                  </pic:nvPicPr>
+                  <pic:blipFill>
+                    <a:blip r:embed="rId10"/>
+                    <a:stretch>
+                      <a:fillRect/>
+                    </a:stretch>
+                  </pic:blipFill>
+                  <pic:spPr>
+                    <a:xfrm>
+                      <a:off x="0" y="0"/>
+                      <a:ext cx="5029200" cy="4055691"/>
+                    </a:xfrm>
+                    <a:prstGeom prst="rect"/>
+                  </pic:spPr>
+                </pic:pic>
+              </a:graphicData>
+            </a:graphic>
+          </wp:inline>
+        </w:drawing>
+      </w:r>
+    </w:p>
+    <w:p>
+      <w:r>
+        <w:rPr>
+          <w:b w:val="0"/>
+          <w:sz w:val="27"/>
+        </w:rPr>
+        <w:t>Visual on screen: a second colour-graded map of Nigeria, same seven North-Central units, shaded from pale gold to deep amber by modeled ransom exposure. IMPORTANT — plain-language note: the national ransom total (₦7.78bn, SBM Intelligence 2026) is not broken down per state in the source data. The figures on this map are calculated by distributing that national total proportionally to each state's share of recorded incidents from Table 1. This is an illustrative modeled estimate, not an independently reported per-state figure — say this explicitly at the podium.</w:t>
+      </w:r>
+    </w:p>
+    <w:p>
+      <w:r>
+        <w:rPr>
+          <w:b/>
+          <w:color w:val="A05A00"/>
+          <w:sz w:val="27"/>
+        </w:rPr>
+        <w:t>SAY: Same pattern, different lens — where the violence is worst, the ransom economy is deepest too. They move together.</w:t>
+      </w:r>
+    </w:p>
+    <w:p>
+      <w:r>
+        <w:rPr>
+          <w:b w:val="0"/>
+          <w:i/>
+          <w:color w:val="666666"/>
+          <w:sz w:val="20"/>
+        </w:rPr>
+        <w:t>Pacing: ~40 sec</w:t>
+      </w:r>
+    </w:p>
     <w:p>
       <w:pPr>
         <w:pStyle w:val="Heading2"/>
@@ -1153,7 +1306,7 @@
           <w:color w:val="A05A00"/>
           <w:sz w:val="30"/>
         </w:rPr>
-        <w:t>SLIDE 4 — The North-Central Security Question</w:t>
+        <w:t>SLIDE 6 — The North-Central Security Question</w:t>
       </w:r>
     </w:p>
     <w:p>
@@ -1195,7 +1348,7 @@
           <w:color w:val="A05A00"/>
           <w:sz w:val="30"/>
         </w:rPr>
-        <w:t>SLIDE 5 — 121 Killed in 10 Weeks — Plateau State</w:t>
+        <w:t>SLIDE 7 — 121 Killed in 10 Weeks — Plateau State</w:t>
       </w:r>
     </w:p>
     <w:p>
@@ -1228,7 +1381,7 @@
           <w:color w:val="A05A00"/>
           <w:sz w:val="30"/>
         </w:rPr>
-        <w:t>SLIDE 6 — A Single Operation, Hundreds of Lives — Niger State</w:t>
+        <w:t>SLIDE 8 — A Single Operation, Hundreds of Lives — Niger State</w:t>
       </w:r>
     </w:p>
     <w:p>
@@ -1261,7 +1414,7 @@
           <w:color w:val="A05A00"/>
           <w:sz w:val="30"/>
         </w:rPr>
-        <w:t>SLIDE 7 — Every State Carries a Share</w:t>
+        <w:t>SLIDE 9 — Every State Carries a Share</w:t>
       </w:r>
     </w:p>
     <w:p>
@@ -1294,7 +1447,7 @@
           <w:color w:val="A05A00"/>
           <w:sz w:val="30"/>
         </w:rPr>
-        <w:t>SLIDE 8 — The Ransom Economy Self-Funds</w:t>
+        <w:t>SLIDE 10 — The Ransom Economy Self-Funds</w:t>
       </w:r>
     </w:p>
     <w:p>
@@ -1327,7 +1480,7 @@
           <w:color w:val="A05A00"/>
           <w:sz w:val="30"/>
         </w:rPr>
-        <w:t>SLIDE 9 — This Is a Development Emergency</w:t>
+        <w:t>SLIDE 11 — This Is a Development Emergency</w:t>
       </w:r>
     </w:p>
     <w:p>
@@ -1360,7 +1513,7 @@
           <w:color w:val="A05A00"/>
           <w:sz w:val="30"/>
         </w:rPr>
-        <w:t>SLIDE 10 — New Security Architecture: One Threat Picture</w:t>
+        <w:t>SLIDE 12 — New Security Architecture: One Threat Picture</w:t>
       </w:r>
     </w:p>
     <w:p>
@@ -1402,7 +1555,7 @@
           <w:color w:val="A05A00"/>
           <w:sz w:val="30"/>
         </w:rPr>
-        <w:t>SLIDE 11 — Regional Security Intelligence &amp; Fusion Centre</w:t>
+        <w:t>SLIDE 13 — Regional Security Intelligence &amp; Fusion Centre</w:t>
       </w:r>
     </w:p>
     <w:p>
@@ -1444,7 +1597,7 @@
           <w:color w:val="A05A00"/>
           <w:sz w:val="30"/>
         </w:rPr>
-        <w:t>SLIDE 12 — Community Early Warning &amp; Early Response Network</w:t>
+        <w:t>SLIDE 14 — Community Early Warning &amp; Early Response Network</w:t>
       </w:r>
     </w:p>
     <w:p>
@@ -1486,7 +1639,7 @@
           <w:color w:val="A05A00"/>
           <w:sz w:val="30"/>
         </w:rPr>
-        <w:t>SLIDE 13 — Traditional Rulers in the Security Architecture</w:t>
+        <w:t>SLIDE 15 — Traditional Rulers in the Security Architecture</w:t>
       </w:r>
     </w:p>
     <w:p>
@@ -1528,7 +1681,7 @@
           <w:color w:val="A05A00"/>
           <w:sz w:val="30"/>
         </w:rPr>
-        <w:t>SLIDE 14 — Security Corridors, Not Administrative Boundaries</w:t>
+        <w:t>SLIDE 16 — Security Corridors, Not Administrative Boundaries</w:t>
       </w:r>
     </w:p>
     <w:p>
@@ -1561,7 +1714,7 @@
           <w:color w:val="A05A00"/>
           <w:sz w:val="30"/>
         </w:rPr>
-        <w:t>SLIDE 15 — Rapid Response: The 30–60 Minute Window</w:t>
+        <w:t>SLIDE 17 — Rapid Response: The 30–60 Minute Window</w:t>
       </w:r>
     </w:p>
     <w:p>
@@ -1603,7 +1756,7 @@
           <w:color w:val="A05A00"/>
           <w:sz w:val="30"/>
         </w:rPr>
-        <w:t>SLIDE 16 — Financially Autonomous Local Governments — The Solution</w:t>
+        <w:t>SLIDE 18 — Financially Autonomous Local Governments — The Solution</w:t>
       </w:r>
     </w:p>
     <w:p>
@@ -1636,7 +1789,7 @@
           <w:color w:val="A05A00"/>
           <w:sz w:val="30"/>
         </w:rPr>
-        <w:t>SLIDE 17 — The Formula</w:t>
+        <w:t>SLIDE 19 — The Formula</w:t>
       </w:r>
     </w:p>
     <w:p>
@@ -1669,7 +1822,7 @@
           <w:color w:val="A05A00"/>
           <w:sz w:val="30"/>
         </w:rPr>
-        <w:t>SLIDE 18 — 5-Year Metrics &amp; Evaluation Roadmap (20-Year Plan)</w:t>
+        <w:t>SLIDE 20 — 5-Year Metrics &amp; Evaluation Roadmap (20-Year Plan)</w:t>
       </w:r>
     </w:p>
     <w:p>
@@ -1955,7 +2108,7 @@
           <w:color w:val="A05A00"/>
           <w:sz w:val="30"/>
         </w:rPr>
-        <w:t>SLIDE 19 — The North-Central Security Compact: Seven Commitments</w:t>
+        <w:t>SLIDE 21 — The North-Central Security Compact: Seven Commitments</w:t>
       </w:r>
     </w:p>
     <w:p>
@@ -1988,7 +2141,7 @@
           <w:color w:val="A05A00"/>
           <w:sz w:val="30"/>
         </w:rPr>
-        <w:t>SLIDE 20 — Closing — The Regional Security Shield</w:t>
+        <w:t>SLIDE 22 — Closing — The Regional Security Shield</w:t>
       </w:r>
     </w:p>
     <w:p>

</xml_diff>

<commit_message>
Add missing slide 20: Five Pillars of Regional Security Architecture (AVM_MORGAN_TALKING_POINTS_20SLIDE_SYNC.docx)
</commit_message>
<xml_diff>
--- a/AVM_MORGAN_TALKING_POINTS_20SLIDE_SYNC.docx
+++ b/AVM_MORGAN_TALKING_POINTS_20SLIDE_SYNC.docx
@@ -1813,6 +1813,90 @@
     </w:p>
     <w:p/>
     <w:p>
+      <w:r>
+        <w:rPr>
+          <w:b/>
+          <w:color w:val="A05A00"/>
+          <w:sz w:val="30"/>
+        </w:rPr>
+        <w:t>SLIDE 20 — Five Pillars of the Regional Security Architecture (CORRECTING OMISSION)</w:t>
+      </w:r>
+    </w:p>
+    <w:p>
+      <w:r>
+        <w:rPr>
+          <w:b w:val="0"/>
+          <w:sz w:val="26"/>
+        </w:rPr>
+        <w:t>Visual on screen: five-pillar grid, exact wording below.</w:t>
+      </w:r>
+    </w:p>
+    <w:p>
+      <w:r>
+        <w:rPr>
+          <w:b w:val="0"/>
+          <w:sz w:val="27"/>
+        </w:rPr>
+        <w:t>1. Strategic Coordination — a North Central Regional Security Council bringing together the states, the Federal Government, security agencies, traditional institutions and other critical stakeholders.</w:t>
+      </w:r>
+    </w:p>
+    <w:p>
+      <w:r>
+        <w:rPr>
+          <w:b w:val="0"/>
+          <w:sz w:val="27"/>
+        </w:rPr>
+        <w:t>2. Intelligence and Early Warning — a Regional Intelligence and Security Fusion Centre, linked to every state and Local Government, so that threats are identified and addressed before they become crises.</w:t>
+      </w:r>
+    </w:p>
+    <w:p>
+      <w:r>
+        <w:rPr>
+          <w:b w:val="0"/>
+          <w:sz w:val="27"/>
+        </w:rPr>
+        <w:t>3. Community Resilience — the Local Government and the community as the foundation of early warning, conflict prevention and public confidence.</w:t>
+      </w:r>
+    </w:p>
+    <w:p>
+      <w:r>
+        <w:rPr>
+          <w:b w:val="0"/>
+          <w:sz w:val="27"/>
+        </w:rPr>
+        <w:t>4. Technology and Infrastructure Protection — ensuring intelligence, communications, surveillance, forensics and emergency response are integrated into the region's development system, and that every major project is built with security by design.</w:t>
+      </w:r>
+    </w:p>
+    <w:p>
+      <w:r>
+        <w:rPr>
+          <w:b w:val="0"/>
+          <w:sz w:val="27"/>
+        </w:rPr>
+        <w:t>5. Sustainable Financing and Human Capacity — including a North Central Security Endowment Fund and the mobilisation of the region's vast pool of experienced military, intelligence, police, technical and professional personnel.</w:t>
+      </w:r>
+    </w:p>
+    <w:p>
+      <w:r>
+        <w:rPr>
+          <w:b/>
+          <w:color w:val="A05A00"/>
+          <w:sz w:val="27"/>
+        </w:rPr>
+        <w:t>SAY (verbatim closing line for this slide): "Our ambition should be very clear: a North Central where farmers can farm, businesses can invest, children can go to school, communities can live in peace, infrastructure can function and development can continue without fear or disruption."</w:t>
+      </w:r>
+    </w:p>
+    <w:p>
+      <w:r>
+        <w:rPr>
+          <w:b w:val="0"/>
+          <w:color w:val="666666"/>
+          <w:sz w:val="20"/>
+        </w:rPr>
+        <w:t>Pacing: ~45 sec</w:t>
+      </w:r>
+    </w:p>
+    <w:p>
       <w:pPr>
         <w:pStyle w:val="Heading2"/>
       </w:pPr>
@@ -1822,7 +1906,7 @@
           <w:color w:val="A05A00"/>
           <w:sz w:val="30"/>
         </w:rPr>
-        <w:t>SLIDE 20 — 5-Year Metrics &amp; Evaluation Roadmap (20-Year Plan)</w:t>
+        <w:t>SLIDE 21 — 5-Year Metrics &amp; Evaluation Roadmap (20-Year Plan)</w:t>
       </w:r>
     </w:p>
     <w:p>
@@ -2108,7 +2192,7 @@
           <w:color w:val="A05A00"/>
           <w:sz w:val="30"/>
         </w:rPr>
-        <w:t>SLIDE 21 — The North-Central Security Compact: Seven Commitments</w:t>
+        <w:t>SLIDE 22 — The North-Central Security Compact: Seven Commitments</w:t>
       </w:r>
     </w:p>
     <w:p>
@@ -2141,7 +2225,7 @@
           <w:color w:val="A05A00"/>
           <w:sz w:val="30"/>
         </w:rPr>
-        <w:t>SLIDE 22 — Closing — The Regional Security Shield</w:t>
+        <w:t>SLIDE 23 — Closing — The Regional Security Shield</w:t>
       </w:r>
     </w:p>
     <w:p>

</xml_diff>